<commit_message>
Fix payee autofill conflict, specific validation errors, Clear Form state crash
</commit_message>
<xml_diff>
--- a/Ulu Payee list.docx
+++ b/Ulu Payee list.docx
@@ -16,39 +16,7 @@
           <w:sz w:val="20"/>
           <w:szCs w:val="20"/>
         </w:rPr>
-        <w:t>Archmedia Sdn Bhd</w:t>
-      </w:r>
-      <w:r>
-        <w:rPr>
-          <w:rFonts w:ascii="Arial Narrow" w:hAnsi="Arial Narrow"/>
-          <w:sz w:val="20"/>
-          <w:szCs w:val="20"/>
-        </w:rPr>
-        <w:t xml:space="preserve"> - </w:t>
-      </w:r>
-      <w:r>
-        <w:rPr>
-          <w:rFonts w:ascii="Arial Narrow" w:hAnsi="Arial Narrow"/>
-          <w:sz w:val="20"/>
-          <w:szCs w:val="20"/>
-        </w:rPr>
-        <w:t xml:space="preserve">CIMB Bank Berhad </w:t>
-      </w:r>
-      <w:r>
-        <w:rPr>
-          <w:rFonts w:ascii="Arial Narrow" w:hAnsi="Arial Narrow"/>
-          <w:sz w:val="20"/>
-          <w:szCs w:val="20"/>
-        </w:rPr>
-        <w:t xml:space="preserve">-Acct No; </w:t>
-      </w:r>
-      <w:r>
-        <w:rPr>
-          <w:rFonts w:ascii="Arial Narrow" w:hAnsi="Arial Narrow"/>
-          <w:sz w:val="20"/>
-          <w:szCs w:val="20"/>
-        </w:rPr>
-        <w:t>8606301129</w:t>
+        <w:t>Archmedia Sdn Bhd - CIMB Bank Berhad -Acct No; 8606301129</w:t>
       </w:r>
       <w:r>
         <w:rPr>
@@ -123,47 +91,7 @@
           <w:sz w:val="20"/>
           <w:szCs w:val="20"/>
         </w:rPr>
-        <w:t xml:space="preserve">Housekeeping- </w:t>
-      </w:r>
-      <w:r>
-        <w:rPr>
-          <w:rFonts w:ascii="Arial Narrow" w:hAnsi="Arial Narrow"/>
-          <w:sz w:val="20"/>
-          <w:szCs w:val="20"/>
-        </w:rPr>
-        <w:t>SITI SHARIZATUL AKMA</w:t>
-      </w:r>
-      <w:r>
-        <w:rPr>
-          <w:rFonts w:ascii="Arial Narrow" w:hAnsi="Arial Narrow"/>
-          <w:sz w:val="20"/>
-          <w:szCs w:val="20"/>
-        </w:rPr>
-        <w:t xml:space="preserve">- </w:t>
-      </w:r>
-      <w:r>
-        <w:rPr>
-          <w:rFonts w:ascii="Arial Narrow" w:hAnsi="Arial Narrow"/>
-          <w:sz w:val="20"/>
-          <w:szCs w:val="20"/>
-        </w:rPr>
-        <w:t>Maybank Berhad</w:t>
-      </w:r>
-      <w:r>
-        <w:rPr>
-          <w:rFonts w:ascii="Arial Narrow" w:hAnsi="Arial Narrow"/>
-          <w:sz w:val="20"/>
-          <w:szCs w:val="20"/>
-        </w:rPr>
-        <w:t xml:space="preserve">- </w:t>
-      </w:r>
-      <w:r>
-        <w:rPr>
-          <w:rFonts w:ascii="Arial Narrow" w:hAnsi="Arial Narrow"/>
-          <w:sz w:val="20"/>
-          <w:szCs w:val="20"/>
-        </w:rPr>
-        <w:t>152152022926</w:t>
+        <w:t>Housekeeping- SITI SHARIZATUL AKMA- Maybank Berhad- 152152022926</w:t>
       </w:r>
       <w:r>
         <w:rPr>
@@ -212,47 +140,7 @@
           <w:sz w:val="20"/>
           <w:szCs w:val="20"/>
         </w:rPr>
-        <w:t xml:space="preserve">Pool Maintenance </w:t>
-      </w:r>
-      <w:r>
-        <w:rPr>
-          <w:rFonts w:ascii="Arial Narrow" w:hAnsi="Arial Narrow"/>
-          <w:sz w:val="20"/>
-          <w:szCs w:val="20"/>
-        </w:rPr>
-        <w:t>QASIM BIN ISMAIL</w:t>
-      </w:r>
-      <w:r>
-        <w:rPr>
-          <w:rFonts w:ascii="Arial Narrow" w:hAnsi="Arial Narrow"/>
-          <w:sz w:val="20"/>
-          <w:szCs w:val="20"/>
-        </w:rPr>
-        <w:t xml:space="preserve">- </w:t>
-      </w:r>
-      <w:r>
-        <w:rPr>
-          <w:rFonts w:ascii="Arial Narrow" w:hAnsi="Arial Narrow"/>
-          <w:sz w:val="20"/>
-          <w:szCs w:val="20"/>
-        </w:rPr>
-        <w:t>Maybank Berhad</w:t>
-      </w:r>
-      <w:r>
-        <w:rPr>
-          <w:rFonts w:ascii="Arial Narrow" w:hAnsi="Arial Narrow"/>
-          <w:sz w:val="20"/>
-          <w:szCs w:val="20"/>
-        </w:rPr>
-        <w:t xml:space="preserve">- </w:t>
-      </w:r>
-      <w:r>
-        <w:rPr>
-          <w:rFonts w:ascii="Arial Narrow" w:hAnsi="Arial Narrow"/>
-          <w:sz w:val="20"/>
-          <w:szCs w:val="20"/>
-        </w:rPr>
-        <w:t>152152063812</w:t>
+        <w:t>Pool Maintenance QASIM BIN ISMAIL- Maybank Berhad- 152152063812</w:t>
       </w:r>
       <w:r>
         <w:rPr>
@@ -301,31 +189,7 @@
           <w:sz w:val="20"/>
           <w:szCs w:val="20"/>
         </w:rPr>
-        <w:t xml:space="preserve">- </w:t>
-      </w:r>
-      <w:r>
-        <w:rPr>
-          <w:rFonts w:ascii="Arial Narrow" w:hAnsi="Arial Narrow"/>
-          <w:sz w:val="20"/>
-          <w:szCs w:val="20"/>
-        </w:rPr>
-        <w:t>Maybank Berhad</w:t>
-      </w:r>
-      <w:r>
-        <w:rPr>
-          <w:rFonts w:ascii="Arial Narrow" w:hAnsi="Arial Narrow"/>
-          <w:sz w:val="20"/>
-          <w:szCs w:val="20"/>
-        </w:rPr>
-        <w:t>-</w:t>
-      </w:r>
-      <w:r>
-        <w:rPr>
-          <w:rFonts w:ascii="Arial Narrow" w:hAnsi="Arial Narrow"/>
-          <w:sz w:val="20"/>
-          <w:szCs w:val="20"/>
-        </w:rPr>
-        <w:t>552077463772</w:t>
+        <w:t>- Maybank Berhad-552077463772</w:t>
       </w:r>
       <w:r>
         <w:rPr>
@@ -456,6 +320,102 @@
           <w:szCs w:val="20"/>
         </w:rPr>
         <w:t>Reimbursables</w:t>
+      </w:r>
+    </w:p>
+    <w:p>
+      <w:pPr>
+        <w:rPr>
+          <w:rFonts w:ascii="Arial Narrow" w:hAnsi="Arial Narrow"/>
+          <w:sz w:val="20"/>
+          <w:szCs w:val="20"/>
+        </w:rPr>
+      </w:pPr>
+    </w:p>
+    <w:p>
+      <w:pPr>
+        <w:rPr>
+          <w:rFonts w:ascii="Arial Narrow" w:hAnsi="Arial Narrow"/>
+          <w:sz w:val="20"/>
+          <w:szCs w:val="20"/>
+        </w:rPr>
+      </w:pPr>
+      <w:r>
+        <w:rPr>
+          <w:rFonts w:ascii="Arial Narrow" w:hAnsi="Arial Narrow"/>
+          <w:sz w:val="20"/>
+          <w:szCs w:val="20"/>
+        </w:rPr>
+        <w:t>MOHD JAMIL BIN IBRAHIM</w:t>
+      </w:r>
+      <w:r>
+        <w:rPr>
+          <w:rFonts w:ascii="Arial Narrow" w:hAnsi="Arial Narrow"/>
+          <w:sz w:val="20"/>
+          <w:szCs w:val="20"/>
+        </w:rPr>
+        <w:t xml:space="preserve">- Bank Pertanian </w:t>
+      </w:r>
+      <w:r>
+        <w:rPr>
+          <w:rFonts w:ascii="Arial Narrow" w:hAnsi="Arial Narrow"/>
+          <w:sz w:val="20"/>
+          <w:szCs w:val="20"/>
+        </w:rPr>
+        <w:t>Agrobank</w:t>
+      </w:r>
+      <w:r>
+        <w:rPr>
+          <w:rFonts w:ascii="Arial Narrow" w:hAnsi="Arial Narrow"/>
+          <w:sz w:val="20"/>
+          <w:szCs w:val="20"/>
+        </w:rPr>
+        <w:t>-</w:t>
+      </w:r>
+      <w:r>
+        <w:t xml:space="preserve"> </w:t>
+      </w:r>
+      <w:r>
+        <w:rPr>
+          <w:rFonts w:ascii="Arial Narrow" w:hAnsi="Arial Narrow"/>
+          <w:sz w:val="20"/>
+          <w:szCs w:val="20"/>
+        </w:rPr>
+        <w:t>2005011000102790</w:t>
+      </w:r>
+      <w:r>
+        <w:rPr>
+          <w:rFonts w:ascii="Arial Narrow" w:hAnsi="Arial Narrow"/>
+          <w:sz w:val="20"/>
+          <w:szCs w:val="20"/>
+        </w:rPr>
+        <w:t>-Mobile no (Azary)</w:t>
+      </w:r>
+      <w:r>
+        <w:t xml:space="preserve"> </w:t>
+      </w:r>
+      <w:r>
+        <w:rPr>
+          <w:rFonts w:ascii="Arial Narrow" w:hAnsi="Arial Narrow"/>
+          <w:sz w:val="20"/>
+          <w:szCs w:val="20"/>
+        </w:rPr>
+        <w:t>+60197537432</w:t>
+      </w:r>
+      <w:r>
+        <w:rPr>
+          <w:rFonts w:ascii="Arial Narrow" w:hAnsi="Arial Narrow"/>
+          <w:sz w:val="20"/>
+          <w:szCs w:val="20"/>
+        </w:rPr>
+        <w:t xml:space="preserve"> </w:t>
+      </w:r>
+      <w:r>
+        <w:rPr>
+          <w:rFonts w:ascii="Arial Narrow" w:hAnsi="Arial Narrow"/>
+          <w:sz w:val="20"/>
+          <w:szCs w:val="20"/>
+        </w:rPr>
+        <w:t>Payment proof sent to Azary (Property Manager)</w:t>
       </w:r>
     </w:p>
     <w:sectPr>

</xml_diff>